<commit_message>
Añadidos nuevas preguntas e imágenes
</commit_message>
<xml_diff>
--- a/build/es_material_wood.docx
+++ b/build/es_material_wood.docx
@@ -25,6 +25,16 @@
       <w:r>
         <w:t>a)</w:t>
         <w:tab/>
+        <w:t>Mucho mayor que la densidad del agua</w:t>
+      </w:r>
+    </w:p>
+    <w:p>
+      <w:pPr>
+        <w:pStyle w:val="Choice"/>
+      </w:pPr>
+      <w:r>
+        <w:t>b)</w:t>
+        <w:tab/>
         <w:t>Parecida a la densidad del agua</w:t>
       </w:r>
     </w:p>
@@ -33,9 +43,9 @@
         <w:pStyle w:val="Choice"/>
       </w:pPr>
       <w:r>
-        <w:t>b)</w:t>
+        <w:t>c)</w:t>
         <w:tab/>
-        <w:t>Mucho mayor que la densidad del agua</w:t>
+        <w:t>Mucho menor que la densidad del agua</w:t>
       </w:r>
     </w:p>
     <w:p>
@@ -43,23 +53,13 @@
         <w:pStyle w:val="Choice"/>
       </w:pPr>
       <w:r>
-        <w:t>c)</w:t>
+        <w:t>d)</w:t>
         <w:tab/>
         <w:t>La madera no tiene densidad</w:t>
       </w:r>
     </w:p>
     <w:p>
       <w:pPr>
-        <w:pStyle w:val="Choice"/>
-      </w:pPr>
-      <w:r>
-        <w:t>d)</w:t>
-        <w:tab/>
-        <w:t>Mucho menor que la densidad del agua</w:t>
-      </w:r>
-    </w:p>
-    <w:p>
-      <w:pPr>
         <w:pStyle w:val="ListNumber"/>
       </w:pPr>
       <w:r>
@@ -73,16 +73,6 @@
       <w:r>
         <w:t>a)</w:t>
         <w:tab/>
-        <w:t>La madera no de debe mojar con agua</w:t>
-      </w:r>
-    </w:p>
-    <w:p>
-      <w:pPr>
-        <w:pStyle w:val="Choice"/>
-      </w:pPr>
-      <w:r>
-        <w:t>b)</w:t>
-        <w:tab/>
         <w:t>La madera siempre se hunde en el agua</w:t>
       </w:r>
     </w:p>
@@ -91,7 +81,7 @@
         <w:pStyle w:val="Choice"/>
       </w:pPr>
       <w:r>
-        <w:t>c)</w:t>
+        <w:t>b)</w:t>
         <w:tab/>
         <w:t>Algunas maderas flotan y otras se hunden</w:t>
       </w:r>
@@ -101,13 +91,23 @@
         <w:pStyle w:val="Choice"/>
       </w:pPr>
       <w:r>
-        <w:t>d)</w:t>
+        <w:t>c)</w:t>
         <w:tab/>
         <w:t>La madera siempre flota en el agua</w:t>
       </w:r>
     </w:p>
     <w:p>
       <w:pPr>
+        <w:pStyle w:val="Choice"/>
+      </w:pPr>
+      <w:r>
+        <w:t>d)</w:t>
+        <w:tab/>
+        <w:t>La madera no de debe mojar con agua</w:t>
+      </w:r>
+    </w:p>
+    <w:p>
+      <w:pPr>
         <w:pStyle w:val="ListNumber"/>
       </w:pPr>
       <w:r>
@@ -121,7 +121,7 @@
       <w:r>
         <w:t>a)</w:t>
         <w:tab/>
-        <w:t>Conduce bien el calor y la electricidad</w:t>
+        <w:t>Conduce bien el calor pero mal la electricidad</w:t>
       </w:r>
     </w:p>
     <w:p>
@@ -141,7 +141,7 @@
       <w:r>
         <w:t>c)</w:t>
         <w:tab/>
-        <w:t>Conduce bien el calor pero mal la electricidad</w:t>
+        <w:t>Es buen aislante eléctrico y térmico</w:t>
       </w:r>
     </w:p>
     <w:p>
@@ -151,7 +151,7 @@
       <w:r>
         <w:t>d)</w:t>
         <w:tab/>
-        <w:t>Es buen aislante eléctrico y térmico</w:t>
+        <w:t>Conduce bien el calor y la electricidad</w:t>
       </w:r>
     </w:p>
     <w:p>
@@ -169,6 +169,16 @@
       <w:r>
         <w:t>a)</w:t>
         <w:tab/>
+        <w:t>Porque el agua puede pudrirla</w:t>
+      </w:r>
+    </w:p>
+    <w:p>
+      <w:pPr>
+        <w:pStyle w:val="Choice"/>
+      </w:pPr>
+      <w:r>
+        <w:t>b)</w:t>
+        <w:tab/>
         <w:t>Porque es respetuosa con el medio ambiente</w:t>
       </w:r>
     </w:p>
@@ -177,9 +187,9 @@
         <w:pStyle w:val="Choice"/>
       </w:pPr>
       <w:r>
-        <w:t>b)</w:t>
+        <w:t>c)</w:t>
         <w:tab/>
-        <w:t>Porque el agua puede pudrirla</w:t>
+        <w:t>Porque absorbe bien la humedad y el agua</w:t>
       </w:r>
     </w:p>
     <w:p>
@@ -187,23 +197,13 @@
         <w:pStyle w:val="Choice"/>
       </w:pPr>
       <w:r>
-        <w:t>c)</w:t>
+        <w:t>d)</w:t>
         <w:tab/>
         <w:t>Porque es muy flexible</w:t>
       </w:r>
     </w:p>
     <w:p>
       <w:pPr>
-        <w:pStyle w:val="Choice"/>
-      </w:pPr>
-      <w:r>
-        <w:t>d)</w:t>
-        <w:tab/>
-        <w:t>Porque absorbe bien la humedad y el agua</w:t>
-      </w:r>
-    </w:p>
-    <w:p>
-      <w:pPr>
         <w:pStyle w:val="ListNumber"/>
       </w:pPr>
       <w:r>
@@ -217,7 +217,7 @@
       <w:r>
         <w:t>a)</w:t>
         <w:tab/>
-        <w:t>Siempre es renovable</w:t>
+        <w:t>Si, si se repueblan los bosques talados.</w:t>
       </w:r>
     </w:p>
     <w:p>
@@ -226,6 +226,16 @@
       </w:pPr>
       <w:r>
         <w:t>b)</w:t>
+        <w:tab/>
+        <w:t>No es renovable</w:t>
+      </w:r>
+    </w:p>
+    <w:p>
+      <w:pPr>
+        <w:pStyle w:val="Choice"/>
+      </w:pPr>
+      <w:r>
+        <w:t>c)</w:t>
         <w:tab/>
         <w:t>Si porque se puede reciclar con facilidad</w:t>
       </w:r>
@@ -235,19 +245,9 @@
         <w:pStyle w:val="Choice"/>
       </w:pPr>
       <w:r>
-        <w:t>c)</w:t>
-        <w:tab/>
-        <w:t>No es renovable</w:t>
-      </w:r>
-    </w:p>
-    <w:p>
-      <w:pPr>
-        <w:pStyle w:val="Choice"/>
-      </w:pPr>
-      <w:r>
         <w:t>d)</w:t>
         <w:tab/>
-        <w:t>Si, si se repueblan los bosques talados.</w:t>
+        <w:t>Siempre es renovable</w:t>
       </w:r>
     </w:p>
     <w:p>
@@ -265,6 +265,16 @@
       <w:r>
         <w:t>a)</w:t>
         <w:tab/>
+        <w:t>Si, porque soporta bien los golpes sin romperse</w:t>
+      </w:r>
+    </w:p>
+    <w:p>
+      <w:pPr>
+        <w:pStyle w:val="Choice"/>
+      </w:pPr>
+      <w:r>
+        <w:t>b)</w:t>
+        <w:tab/>
         <w:t>No, es blanda</w:t>
       </w:r>
     </w:p>
@@ -273,19 +283,57 @@
         <w:pStyle w:val="Choice"/>
       </w:pPr>
       <w:r>
-        <w:t>b)</w:t>
+        <w:t>c)</w:t>
+        <w:tab/>
+        <w:t>Si, porque tiene buena resistencia mecánica</w:t>
+      </w:r>
+    </w:p>
+    <w:p>
+      <w:pPr>
+        <w:pStyle w:val="Choice"/>
+      </w:pPr>
+      <w:r>
+        <w:t>d)</w:t>
         <w:tab/>
         <w:t>Si, porque soporta bien que la intenten rayar</w:t>
       </w:r>
     </w:p>
     <w:p>
       <w:pPr>
+        <w:pStyle w:val="ListNumber"/>
+      </w:pPr>
+      <w:r>
+        <w:t>¿Qué es la albura de un tronco?</w:t>
+      </w:r>
+    </w:p>
+    <w:p>
+      <w:pPr>
+        <w:pStyle w:val="Choice"/>
+      </w:pPr>
+      <w:r>
+        <w:t>a)</w:t>
+        <w:tab/>
+        <w:t>Es la parte exterior del tronco</w:t>
+      </w:r>
+    </w:p>
+    <w:p>
+      <w:pPr>
+        <w:pStyle w:val="Choice"/>
+      </w:pPr>
+      <w:r>
+        <w:t>b)</w:t>
+        <w:tab/>
+        <w:t>Es la parte exterior del tronco, más joven y de color más claro</w:t>
+      </w:r>
+    </w:p>
+    <w:p>
+      <w:pPr>
         <w:pStyle w:val="Choice"/>
       </w:pPr>
       <w:r>
         <w:t>c)</w:t>
         <w:tab/>
-        <w:t>Si, porque soporta bien los golpes sin romperse</w:t>
+        <w:t>Es todo el interior del tronco excepto la corteza</w:t>
       </w:r>
     </w:p>
     <w:p>
@@ -295,7 +343,7 @@
       <w:r>
         <w:t>d)</w:t>
         <w:tab/>
-        <w:t>Si, porque tiene buena resistencia mecánica</w:t>
+        <w:t>Es la parte interior del tronco, más antigua y de color más oscuro</w:t>
       </w:r>
     </w:p>
     <w:p>
@@ -303,7 +351,7 @@
         <w:pStyle w:val="ListNumber"/>
       </w:pPr>
       <w:r>
-        <w:t>¿Qué es la albura de un tronco?</w:t>
+        <w:t>¿Qué es el duramen de un tronco?</w:t>
       </w:r>
     </w:p>
     <w:p>
@@ -323,6 +371,16 @@
       <w:r>
         <w:t>b)</w:t>
         <w:tab/>
+        <w:t>Es la parte exterior del tronco, más joven y de color más claro</w:t>
+      </w:r>
+    </w:p>
+    <w:p>
+      <w:pPr>
+        <w:pStyle w:val="Choice"/>
+      </w:pPr>
+      <w:r>
+        <w:t>c)</w:t>
+        <w:tab/>
         <w:t>Es la parte exterior del tronco</w:t>
       </w:r>
     </w:p>
@@ -331,71 +389,13 @@
         <w:pStyle w:val="Choice"/>
       </w:pPr>
       <w:r>
-        <w:t>c)</w:t>
+        <w:t>d)</w:t>
         <w:tab/>
         <w:t>Es la parte interior del tronco, más antigua y de color más oscuro</w:t>
       </w:r>
     </w:p>
     <w:p>
       <w:pPr>
-        <w:pStyle w:val="Choice"/>
-      </w:pPr>
-      <w:r>
-        <w:t>d)</w:t>
-        <w:tab/>
-        <w:t>Es la parte exterior del tronco, más joven y de color más claro</w:t>
-      </w:r>
-    </w:p>
-    <w:p>
-      <w:pPr>
-        <w:pStyle w:val="ListNumber"/>
-      </w:pPr>
-      <w:r>
-        <w:t>¿Qué es el duramen de un tronco?</w:t>
-      </w:r>
-    </w:p>
-    <w:p>
-      <w:pPr>
-        <w:pStyle w:val="Choice"/>
-      </w:pPr>
-      <w:r>
-        <w:t>a)</w:t>
-        <w:tab/>
-        <w:t>Es la parte interior del tronco, más antigua y de color más oscuro</w:t>
-      </w:r>
-    </w:p>
-    <w:p>
-      <w:pPr>
-        <w:pStyle w:val="Choice"/>
-      </w:pPr>
-      <w:r>
-        <w:t>b)</w:t>
-        <w:tab/>
-        <w:t>Es la parte exterior del tronco</w:t>
-      </w:r>
-    </w:p>
-    <w:p>
-      <w:pPr>
-        <w:pStyle w:val="Choice"/>
-      </w:pPr>
-      <w:r>
-        <w:t>c)</w:t>
-        <w:tab/>
-        <w:t>Es la parte exterior del tronco, más joven y de color más claro</w:t>
-      </w:r>
-    </w:p>
-    <w:p>
-      <w:pPr>
-        <w:pStyle w:val="Choice"/>
-      </w:pPr>
-      <w:r>
-        <w:t>d)</w:t>
-        <w:tab/>
-        <w:t>Es todo el interior del tronco excepto la corteza</w:t>
-      </w:r>
-    </w:p>
-    <w:p>
-      <w:pPr>
         <w:pStyle w:val="ListNumber"/>
       </w:pPr>
       <w:r>
@@ -409,16 +409,6 @@
       <w:r>
         <w:t>a)</w:t>
         <w:tab/>
-        <w:t>El duramen del tronco se aprovecha para hacer serrin</w:t>
-      </w:r>
-    </w:p>
-    <w:p>
-      <w:pPr>
-        <w:pStyle w:val="Choice"/>
-      </w:pPr>
-      <w:r>
-        <w:t>b)</w:t>
-        <w:tab/>
         <w:t>La corteza del alcornoque es corcho, que tiene muchas aplicaciones</w:t>
       </w:r>
     </w:p>
@@ -427,9 +417,19 @@
         <w:pStyle w:val="Choice"/>
       </w:pPr>
       <w:r>
+        <w:t>b)</w:t>
+        <w:tab/>
+        <w:t>La albura se puede aprovechar en ciertas maderas</w:t>
+      </w:r>
+    </w:p>
+    <w:p>
+      <w:pPr>
+        <w:pStyle w:val="Choice"/>
+      </w:pPr>
+      <w:r>
         <w:t>c)</w:t>
         <w:tab/>
-        <w:t>La albura se puede aprovechar en ciertas maderas</w:t>
+        <w:t>El duramen del tronco se aprovecha para hacer serrin</w:t>
       </w:r>
     </w:p>
     <w:p>
@@ -457,6 +457,26 @@
       <w:r>
         <w:t>a)</w:t>
         <w:tab/>
+        <w:t>Aserrado del tronco</w:t>
+      </w:r>
+    </w:p>
+    <w:p>
+      <w:pPr>
+        <w:pStyle w:val="Choice"/>
+      </w:pPr>
+      <w:r>
+        <w:t>b)</w:t>
+        <w:tab/>
+        <w:t>Ninguna es correcta</w:t>
+      </w:r>
+    </w:p>
+    <w:p>
+      <w:pPr>
+        <w:pStyle w:val="Choice"/>
+      </w:pPr>
+      <w:r>
+        <w:t>c)</w:t>
+        <w:tab/>
         <w:t>Tala del árbol</w:t>
       </w:r>
     </w:p>
@@ -465,33 +485,13 @@
         <w:pStyle w:val="Choice"/>
       </w:pPr>
       <w:r>
-        <w:t>b)</w:t>
-        <w:tab/>
-        <w:t>Aserrado del tronco</w:t>
-      </w:r>
-    </w:p>
-    <w:p>
-      <w:pPr>
-        <w:pStyle w:val="Choice"/>
-      </w:pPr>
-      <w:r>
-        <w:t>c)</w:t>
+        <w:t>d)</w:t>
         <w:tab/>
         <w:t>Corte de tablones</w:t>
       </w:r>
     </w:p>
     <w:p>
       <w:pPr>
-        <w:pStyle w:val="Choice"/>
-      </w:pPr>
-      <w:r>
-        <w:t>d)</w:t>
-        <w:tab/>
-        <w:t>Ninguna es correcta</w:t>
-      </w:r>
-    </w:p>
-    <w:p>
-      <w:pPr>
         <w:pStyle w:val="ListNumber"/>
       </w:pPr>
       <w:r>
@@ -505,7 +505,7 @@
       <w:r>
         <w:t>a)</w:t>
         <w:tab/>
-        <w:t>Tala</w:t>
+        <w:t>Asierrado</w:t>
       </w:r>
     </w:p>
     <w:p>
@@ -514,6 +514,16 @@
       </w:pPr>
       <w:r>
         <w:t>b)</w:t>
+        <w:tab/>
+        <w:t>Aserrado</w:t>
+      </w:r>
+    </w:p>
+    <w:p>
+      <w:pPr>
+        <w:pStyle w:val="Choice"/>
+      </w:pPr>
+      <w:r>
+        <w:t>c)</w:t>
         <w:tab/>
         <w:t>Recortado</w:t>
       </w:r>
@@ -523,9 +533,604 @@
         <w:pStyle w:val="Choice"/>
       </w:pPr>
       <w:r>
+        <w:t>d)</w:t>
+        <w:tab/>
+        <w:t>Tala</w:t>
+      </w:r>
+    </w:p>
+    <w:p>
+      <w:pPr>
+        <w:pStyle w:val="ListNumber"/>
+      </w:pPr>
+      <w:r>
+        <w:t>¿Cómo se llama una tira fina de madera de sección rectangular o redonda?</w:t>
+      </w:r>
+    </w:p>
+    <w:p>
+      <w:pPr>
+        <w:pStyle w:val="Choice"/>
+      </w:pPr>
+      <w:r>
+        <w:t>a)</w:t>
+        <w:tab/>
+        <w:t>Tablón</w:t>
+      </w:r>
+    </w:p>
+    <w:p>
+      <w:pPr>
+        <w:pStyle w:val="Choice"/>
+      </w:pPr>
+      <w:r>
+        <w:t>b)</w:t>
+        <w:tab/>
+        <w:t>Viga</w:t>
+      </w:r>
+    </w:p>
+    <w:p>
+      <w:pPr>
+        <w:pStyle w:val="Choice"/>
+      </w:pPr>
+      <w:r>
         <w:t>c)</w:t>
         <w:tab/>
-        <w:t>Asierrado</w:t>
+        <w:t>Tabla</w:t>
+      </w:r>
+    </w:p>
+    <w:p>
+      <w:pPr>
+        <w:pStyle w:val="Choice"/>
+      </w:pPr>
+      <w:r>
+        <w:t>d)</w:t>
+        <w:tab/>
+        <w:t>Listones</w:t>
+      </w:r>
+    </w:p>
+    <w:p>
+      <w:pPr>
+        <w:pStyle w:val="ListNumber"/>
+      </w:pPr>
+      <w:r>
+        <w:t>¿Cómo se llama una madera de grandes dimensiones de forma rectangular?</w:t>
+      </w:r>
+    </w:p>
+    <w:p>
+      <w:pPr>
+        <w:pStyle w:val="Choice"/>
+      </w:pPr>
+      <w:r>
+        <w:t>a)</w:t>
+        <w:tab/>
+        <w:t>Tabla</w:t>
+      </w:r>
+    </w:p>
+    <w:p>
+      <w:pPr>
+        <w:pStyle w:val="Choice"/>
+      </w:pPr>
+      <w:r>
+        <w:t>b)</w:t>
+        <w:tab/>
+        <w:t>Tablero</w:t>
+      </w:r>
+    </w:p>
+    <w:p>
+      <w:pPr>
+        <w:pStyle w:val="Choice"/>
+      </w:pPr>
+      <w:r>
+        <w:t>c)</w:t>
+        <w:tab/>
+        <w:t>Viga</w:t>
+      </w:r>
+    </w:p>
+    <w:p>
+      <w:pPr>
+        <w:pStyle w:val="Choice"/>
+      </w:pPr>
+      <w:r>
+        <w:t>d)</w:t>
+        <w:tab/>
+        <w:t>Listones</w:t>
+      </w:r>
+    </w:p>
+    <w:p>
+      <w:pPr>
+        <w:pStyle w:val="ListNumber"/>
+      </w:pPr>
+      <w:r>
+        <w:t>¿Cómo se llama una madera plana de gran superficie y poco gruesa?</w:t>
+      </w:r>
+    </w:p>
+    <w:p>
+      <w:pPr>
+        <w:pStyle w:val="Choice"/>
+      </w:pPr>
+      <w:r>
+        <w:t>a)</w:t>
+        <w:tab/>
+        <w:t>Moldura</w:t>
+      </w:r>
+    </w:p>
+    <w:p>
+      <w:pPr>
+        <w:pStyle w:val="Choice"/>
+      </w:pPr>
+      <w:r>
+        <w:t>b)</w:t>
+        <w:tab/>
+        <w:t>Viga</w:t>
+      </w:r>
+    </w:p>
+    <w:p>
+      <w:pPr>
+        <w:pStyle w:val="Choice"/>
+      </w:pPr>
+      <w:r>
+        <w:t>c)</w:t>
+        <w:tab/>
+        <w:t>Chapa o tablero</w:t>
+      </w:r>
+    </w:p>
+    <w:p>
+      <w:pPr>
+        <w:pStyle w:val="Choice"/>
+      </w:pPr>
+      <w:r>
+        <w:t>d)</w:t>
+        <w:tab/>
+        <w:t>Tablón</w:t>
+      </w:r>
+    </w:p>
+    <w:p>
+      <w:pPr>
+        <w:pStyle w:val="ListNumber"/>
+      </w:pPr>
+      <w:r>
+        <w:t>¿Cuál de estas maderas es blanda?</w:t>
+      </w:r>
+    </w:p>
+    <w:p>
+      <w:pPr>
+        <w:pStyle w:val="Choice"/>
+      </w:pPr>
+      <w:r>
+        <w:t>a)</w:t>
+        <w:tab/>
+        <w:t>Roble</w:t>
+      </w:r>
+    </w:p>
+    <w:p>
+      <w:pPr>
+        <w:pStyle w:val="Choice"/>
+      </w:pPr>
+      <w:r>
+        <w:t>b)</w:t>
+        <w:tab/>
+        <w:t>Pino</w:t>
+      </w:r>
+    </w:p>
+    <w:p>
+      <w:pPr>
+        <w:pStyle w:val="Choice"/>
+      </w:pPr>
+      <w:r>
+        <w:t>c)</w:t>
+        <w:tab/>
+        <w:t>Nogal</w:t>
+      </w:r>
+    </w:p>
+    <w:p>
+      <w:pPr>
+        <w:pStyle w:val="Choice"/>
+      </w:pPr>
+      <w:r>
+        <w:t>d)</w:t>
+        <w:tab/>
+        <w:t>Haya</w:t>
+      </w:r>
+    </w:p>
+    <w:p>
+      <w:pPr>
+        <w:pStyle w:val="ListNumber"/>
+      </w:pPr>
+      <w:r>
+        <w:t>¿Cuál de estas maderas es blanda?</w:t>
+      </w:r>
+    </w:p>
+    <w:p>
+      <w:pPr>
+        <w:pStyle w:val="Choice"/>
+      </w:pPr>
+      <w:r>
+        <w:t>a)</w:t>
+        <w:tab/>
+        <w:t>Chopo</w:t>
+      </w:r>
+    </w:p>
+    <w:p>
+      <w:pPr>
+        <w:pStyle w:val="Choice"/>
+      </w:pPr>
+      <w:r>
+        <w:t>b)</w:t>
+        <w:tab/>
+        <w:t>Roble</w:t>
+      </w:r>
+    </w:p>
+    <w:p>
+      <w:pPr>
+        <w:pStyle w:val="Choice"/>
+      </w:pPr>
+      <w:r>
+        <w:t>c)</w:t>
+        <w:tab/>
+        <w:t>Haya</w:t>
+      </w:r>
+    </w:p>
+    <w:p>
+      <w:pPr>
+        <w:pStyle w:val="Choice"/>
+      </w:pPr>
+      <w:r>
+        <w:t>d)</w:t>
+        <w:tab/>
+        <w:t>Castaño</w:t>
+      </w:r>
+    </w:p>
+    <w:p>
+      <w:pPr>
+        <w:pStyle w:val="ListNumber"/>
+      </w:pPr>
+      <w:r>
+        <w:t>Los distintos tipos de maderas tienen una dureza</w:t>
+      </w:r>
+    </w:p>
+    <w:p>
+      <w:pPr>
+        <w:pStyle w:val="Choice"/>
+      </w:pPr>
+      <w:r>
+        <w:t>a)</w:t>
+        <w:tab/>
+        <w:t>Similar</w:t>
+      </w:r>
+    </w:p>
+    <w:p>
+      <w:pPr>
+        <w:pStyle w:val="Choice"/>
+      </w:pPr>
+      <w:r>
+        <w:t>b)</w:t>
+        <w:tab/>
+        <w:t>Verdadero</w:t>
+      </w:r>
+    </w:p>
+    <w:p>
+      <w:pPr>
+        <w:pStyle w:val="ListNumber"/>
+      </w:pPr>
+      <w:r>
+        <w:t>El veteado de la madera es</w:t>
+      </w:r>
+    </w:p>
+    <w:p>
+      <w:pPr>
+        <w:pStyle w:val="Choice"/>
+      </w:pPr>
+      <w:r>
+        <w:t>a)</w:t>
+        <w:tab/>
+        <w:t>Algo que debe esconderse</w:t>
+      </w:r>
+    </w:p>
+    <w:p>
+      <w:pPr>
+        <w:pStyle w:val="Choice"/>
+      </w:pPr>
+      <w:r>
+        <w:t>b)</w:t>
+        <w:tab/>
+        <w:t>La madera no tiene veteado</w:t>
+      </w:r>
+    </w:p>
+    <w:p>
+      <w:pPr>
+        <w:pStyle w:val="Choice"/>
+      </w:pPr>
+      <w:r>
+        <w:t>c)</w:t>
+        <w:tab/>
+        <w:t>Muy apreciado</w:t>
+      </w:r>
+    </w:p>
+    <w:p>
+      <w:pPr>
+        <w:pStyle w:val="Choice"/>
+      </w:pPr>
+      <w:r>
+        <w:t>d)</w:t>
+        <w:tab/>
+        <w:t>Poco apreciado</w:t>
+      </w:r>
+    </w:p>
+    <w:p>
+      <w:pPr>
+        <w:pStyle w:val="ListNumber"/>
+      </w:pPr>
+      <w:r>
+        <w:t>El tablero de contrachapado es</w:t>
+      </w:r>
+    </w:p>
+    <w:p>
+      <w:pPr>
+        <w:pStyle w:val="Choice"/>
+      </w:pPr>
+      <w:r>
+        <w:t>a)</w:t>
+        <w:tab/>
+        <w:t>Un tablero artificial formado por fibras de madera y resina sintética</w:t>
+      </w:r>
+    </w:p>
+    <w:p>
+      <w:pPr>
+        <w:pStyle w:val="Choice"/>
+      </w:pPr>
+      <w:r>
+        <w:t>b)</w:t>
+        <w:tab/>
+        <w:t>Un tablero artificial formado por virutas y cola comprimidas</w:t>
+      </w:r>
+    </w:p>
+    <w:p>
+      <w:pPr>
+        <w:pStyle w:val="Choice"/>
+      </w:pPr>
+      <w:r>
+        <w:t>c)</w:t>
+        <w:tab/>
+        <w:t>Un tablero artificial formado por láminas de madera encoladas</w:t>
+      </w:r>
+    </w:p>
+    <w:p>
+      <w:pPr>
+        <w:pStyle w:val="Choice"/>
+      </w:pPr>
+      <w:r>
+        <w:t>d)</w:t>
+        <w:tab/>
+        <w:t>Un tablero de madera maziza</w:t>
+      </w:r>
+    </w:p>
+    <w:p>
+      <w:pPr>
+        <w:pStyle w:val="ListNumber"/>
+      </w:pPr>
+      <w:r>
+        <w:t>El tablero de aglomerado es</w:t>
+      </w:r>
+    </w:p>
+    <w:p>
+      <w:pPr>
+        <w:pStyle w:val="Choice"/>
+      </w:pPr>
+      <w:r>
+        <w:t>a)</w:t>
+        <w:tab/>
+        <w:t>Un tablero artificial formado por virutas y cola comprimidas</w:t>
+      </w:r>
+    </w:p>
+    <w:p>
+      <w:pPr>
+        <w:pStyle w:val="Choice"/>
+      </w:pPr>
+      <w:r>
+        <w:t>b)</w:t>
+        <w:tab/>
+        <w:t>Un tablero artificial formado por fibras de madera y resina sintética</w:t>
+      </w:r>
+    </w:p>
+    <w:p>
+      <w:pPr>
+        <w:pStyle w:val="Choice"/>
+      </w:pPr>
+      <w:r>
+        <w:t>c)</w:t>
+        <w:tab/>
+        <w:t>Un tablero artificial formado por láminas de madera encoladas</w:t>
+      </w:r>
+    </w:p>
+    <w:p>
+      <w:pPr>
+        <w:pStyle w:val="Choice"/>
+      </w:pPr>
+      <w:r>
+        <w:t>d)</w:t>
+        <w:tab/>
+        <w:t>Un tablero de madera maziza</w:t>
+      </w:r>
+    </w:p>
+    <w:p>
+      <w:pPr>
+        <w:pStyle w:val="ListNumber"/>
+      </w:pPr>
+      <w:r>
+        <w:t>El DM o tablero de fibras es</w:t>
+      </w:r>
+    </w:p>
+    <w:p>
+      <w:pPr>
+        <w:pStyle w:val="Choice"/>
+      </w:pPr>
+      <w:r>
+        <w:t>a)</w:t>
+        <w:tab/>
+        <w:t>Un tablero artificial formado por fibras de madera y resina sintética</w:t>
+      </w:r>
+    </w:p>
+    <w:p>
+      <w:pPr>
+        <w:pStyle w:val="Choice"/>
+      </w:pPr>
+      <w:r>
+        <w:t>b)</w:t>
+        <w:tab/>
+        <w:t>Un tablero artificial formado por virutas y cola comprimidas</w:t>
+      </w:r>
+    </w:p>
+    <w:p>
+      <w:pPr>
+        <w:pStyle w:val="Choice"/>
+      </w:pPr>
+      <w:r>
+        <w:t>c)</w:t>
+        <w:tab/>
+        <w:t>Un tablero artificial formado por láminas de madera encoladas</w:t>
+      </w:r>
+    </w:p>
+    <w:p>
+      <w:pPr>
+        <w:pStyle w:val="Choice"/>
+      </w:pPr>
+      <w:r>
+        <w:t>d)</w:t>
+        <w:tab/>
+        <w:t>Un tablero de madera maziza</w:t>
+      </w:r>
+    </w:p>
+    <w:p>
+      <w:pPr>
+        <w:pStyle w:val="ListNumber"/>
+      </w:pPr>
+      <w:r>
+        <w:t>A los tableros artificiales se les suele pegar en el exterior una  chapa de madera natural o de material plástico.</w:t>
+        <w:br/>
+      </w:r>
+    </w:p>
+    <w:p>
+      <w:pPr>
+        <w:pStyle w:val="Choice"/>
+      </w:pPr>
+      <w:r>
+        <w:t>a)</w:t>
+        <w:tab/>
+        <w:t>No, los tableros artificiales no se pueden tapar</w:t>
+      </w:r>
+    </w:p>
+    <w:p>
+      <w:pPr>
+        <w:pStyle w:val="Choice"/>
+      </w:pPr>
+      <w:r>
+        <w:t>b)</w:t>
+        <w:tab/>
+        <w:t>Si, mejora la resistencia y aspecto del tablero artificial.</w:t>
+      </w:r>
+    </w:p>
+    <w:p>
+      <w:pPr>
+        <w:pStyle w:val="Choice"/>
+      </w:pPr>
+      <w:r>
+        <w:t>c)</w:t>
+        <w:tab/>
+        <w:t>No, los tableros artificiales solo se pintan</w:t>
+      </w:r>
+    </w:p>
+    <w:p>
+      <w:pPr>
+        <w:pStyle w:val="Choice"/>
+      </w:pPr>
+      <w:r>
+        <w:t>d)</w:t>
+        <w:tab/>
+        <w:t>Si, aunque eso disminuye la resistencia del tablero</w:t>
+      </w:r>
+    </w:p>
+    <w:p>
+      <w:pPr>
+        <w:pStyle w:val="ListNumber"/>
+      </w:pPr>
+      <w:r>
+        <w:t>La operación de aserrado de la madera sigue los siguientes pasos</w:t>
+      </w:r>
+    </w:p>
+    <w:p>
+      <w:pPr>
+        <w:pStyle w:val="Choice"/>
+      </w:pPr>
+      <w:r>
+        <w:t>a)</w:t>
+        <w:tab/>
+        <w:t>Medir. Marcar. Serrar. Sujetar</w:t>
+      </w:r>
+    </w:p>
+    <w:p>
+      <w:pPr>
+        <w:pStyle w:val="Choice"/>
+      </w:pPr>
+      <w:r>
+        <w:t>b)</w:t>
+        <w:tab/>
+        <w:t>Marcar. Medir. Sujetar. Serrar</w:t>
+      </w:r>
+    </w:p>
+    <w:p>
+      <w:pPr>
+        <w:pStyle w:val="Choice"/>
+      </w:pPr>
+      <w:r>
+        <w:t>c)</w:t>
+        <w:tab/>
+        <w:t>Serrar. Pulir. Pintar</w:t>
+      </w:r>
+    </w:p>
+    <w:p>
+      <w:pPr>
+        <w:pStyle w:val="Choice"/>
+      </w:pPr>
+      <w:r>
+        <w:t>d)</w:t>
+        <w:tab/>
+        <w:t>Medir. Marcar. Sujetar. Serrar</w:t>
+      </w:r>
+    </w:p>
+    <w:p>
+      <w:pPr>
+        <w:pStyle w:val="ListNumber"/>
+      </w:pPr>
+      <w:r>
+        <w:t>La operación que consiste en la separación de las piezas de madera se llama</w:t>
+      </w:r>
+    </w:p>
+    <w:p>
+      <w:pPr>
+        <w:pStyle w:val="Choice"/>
+      </w:pPr>
+      <w:r>
+        <w:t>a)</w:t>
+        <w:tab/>
+        <w:t>Corte</w:t>
+      </w:r>
+    </w:p>
+    <w:p>
+      <w:pPr>
+        <w:pStyle w:val="Choice"/>
+      </w:pPr>
+      <w:r>
+        <w:t>b)</w:t>
+        <w:tab/>
+        <w:t>Separado</w:t>
+      </w:r>
+    </w:p>
+    <w:p>
+      <w:pPr>
+        <w:pStyle w:val="Choice"/>
+      </w:pPr>
+      <w:r>
+        <w:t>c)</w:t>
+        <w:tab/>
+        <w:t>Talado</w:t>
       </w:r>
     </w:p>
     <w:p>
@@ -543,611 +1148,6 @@
         <w:pStyle w:val="ListNumber"/>
       </w:pPr>
       <w:r>
-        <w:t>¿Cómo se llama una tira fina de madera de sección rectangular o redonda?</w:t>
-      </w:r>
-    </w:p>
-    <w:p>
-      <w:pPr>
-        <w:pStyle w:val="Choice"/>
-      </w:pPr>
-      <w:r>
-        <w:t>a)</w:t>
-        <w:tab/>
-        <w:t>Listones</w:t>
-      </w:r>
-    </w:p>
-    <w:p>
-      <w:pPr>
-        <w:pStyle w:val="Choice"/>
-      </w:pPr>
-      <w:r>
-        <w:t>b)</w:t>
-        <w:tab/>
-        <w:t>Tabla</w:t>
-      </w:r>
-    </w:p>
-    <w:p>
-      <w:pPr>
-        <w:pStyle w:val="Choice"/>
-      </w:pPr>
-      <w:r>
-        <w:t>c)</w:t>
-        <w:tab/>
-        <w:t>Viga</w:t>
-      </w:r>
-    </w:p>
-    <w:p>
-      <w:pPr>
-        <w:pStyle w:val="Choice"/>
-      </w:pPr>
-      <w:r>
-        <w:t>d)</w:t>
-        <w:tab/>
-        <w:t>Tablón</w:t>
-      </w:r>
-    </w:p>
-    <w:p>
-      <w:pPr>
-        <w:pStyle w:val="ListNumber"/>
-      </w:pPr>
-      <w:r>
-        <w:t>¿Cómo se llama una madera de grandes dimensiones de forma rectangular?</w:t>
-      </w:r>
-    </w:p>
-    <w:p>
-      <w:pPr>
-        <w:pStyle w:val="Choice"/>
-      </w:pPr>
-      <w:r>
-        <w:t>a)</w:t>
-        <w:tab/>
-        <w:t>Tablero</w:t>
-      </w:r>
-    </w:p>
-    <w:p>
-      <w:pPr>
-        <w:pStyle w:val="Choice"/>
-      </w:pPr>
-      <w:r>
-        <w:t>b)</w:t>
-        <w:tab/>
-        <w:t>Viga</w:t>
-      </w:r>
-    </w:p>
-    <w:p>
-      <w:pPr>
-        <w:pStyle w:val="Choice"/>
-      </w:pPr>
-      <w:r>
-        <w:t>c)</w:t>
-        <w:tab/>
-        <w:t>Listones</w:t>
-      </w:r>
-    </w:p>
-    <w:p>
-      <w:pPr>
-        <w:pStyle w:val="Choice"/>
-      </w:pPr>
-      <w:r>
-        <w:t>d)</w:t>
-        <w:tab/>
-        <w:t>Tabla</w:t>
-      </w:r>
-    </w:p>
-    <w:p>
-      <w:pPr>
-        <w:pStyle w:val="ListNumber"/>
-      </w:pPr>
-      <w:r>
-        <w:t>¿Cómo se llama una madera plana de gran superficie y poco gruesa?</w:t>
-      </w:r>
-    </w:p>
-    <w:p>
-      <w:pPr>
-        <w:pStyle w:val="Choice"/>
-      </w:pPr>
-      <w:r>
-        <w:t>a)</w:t>
-        <w:tab/>
-        <w:t>Chapa o tablero</w:t>
-      </w:r>
-    </w:p>
-    <w:p>
-      <w:pPr>
-        <w:pStyle w:val="Choice"/>
-      </w:pPr>
-      <w:r>
-        <w:t>b)</w:t>
-        <w:tab/>
-        <w:t>Tablón</w:t>
-      </w:r>
-    </w:p>
-    <w:p>
-      <w:pPr>
-        <w:pStyle w:val="Choice"/>
-      </w:pPr>
-      <w:r>
-        <w:t>c)</w:t>
-        <w:tab/>
-        <w:t>Moldura</w:t>
-      </w:r>
-    </w:p>
-    <w:p>
-      <w:pPr>
-        <w:pStyle w:val="Choice"/>
-      </w:pPr>
-      <w:r>
-        <w:t>d)</w:t>
-        <w:tab/>
-        <w:t>Viga</w:t>
-      </w:r>
-    </w:p>
-    <w:p>
-      <w:pPr>
-        <w:pStyle w:val="ListNumber"/>
-      </w:pPr>
-      <w:r>
-        <w:t>¿Cuál de estas maderas es blanda?</w:t>
-      </w:r>
-    </w:p>
-    <w:p>
-      <w:pPr>
-        <w:pStyle w:val="Choice"/>
-      </w:pPr>
-      <w:r>
-        <w:t>a)</w:t>
-        <w:tab/>
-        <w:t>Pino</w:t>
-      </w:r>
-    </w:p>
-    <w:p>
-      <w:pPr>
-        <w:pStyle w:val="Choice"/>
-      </w:pPr>
-      <w:r>
-        <w:t>b)</w:t>
-        <w:tab/>
-        <w:t>Nogal</w:t>
-      </w:r>
-    </w:p>
-    <w:p>
-      <w:pPr>
-        <w:pStyle w:val="Choice"/>
-      </w:pPr>
-      <w:r>
-        <w:t>c)</w:t>
-        <w:tab/>
-        <w:t>Haya</w:t>
-      </w:r>
-    </w:p>
-    <w:p>
-      <w:pPr>
-        <w:pStyle w:val="Choice"/>
-      </w:pPr>
-      <w:r>
-        <w:t>d)</w:t>
-        <w:tab/>
-        <w:t>Roble</w:t>
-      </w:r>
-    </w:p>
-    <w:p>
-      <w:pPr>
-        <w:pStyle w:val="ListNumber"/>
-      </w:pPr>
-      <w:r>
-        <w:t>¿Cuál de estas maderas es blanda?</w:t>
-      </w:r>
-    </w:p>
-    <w:p>
-      <w:pPr>
-        <w:pStyle w:val="Choice"/>
-      </w:pPr>
-      <w:r>
-        <w:t>a)</w:t>
-        <w:tab/>
-        <w:t>Haya</w:t>
-      </w:r>
-    </w:p>
-    <w:p>
-      <w:pPr>
-        <w:pStyle w:val="Choice"/>
-      </w:pPr>
-      <w:r>
-        <w:t>b)</w:t>
-        <w:tab/>
-        <w:t>Castaño</w:t>
-      </w:r>
-    </w:p>
-    <w:p>
-      <w:pPr>
-        <w:pStyle w:val="Choice"/>
-      </w:pPr>
-      <w:r>
-        <w:t>c)</w:t>
-        <w:tab/>
-        <w:t>Chopo</w:t>
-      </w:r>
-    </w:p>
-    <w:p>
-      <w:pPr>
-        <w:pStyle w:val="Choice"/>
-      </w:pPr>
-      <w:r>
-        <w:t>d)</w:t>
-        <w:tab/>
-        <w:t>Roble</w:t>
-      </w:r>
-    </w:p>
-    <w:p>
-      <w:pPr>
-        <w:pStyle w:val="ListNumber"/>
-      </w:pPr>
-      <w:r>
-        <w:t>Los distintos tipos de maderas tienen una dureza</w:t>
-      </w:r>
-    </w:p>
-    <w:p>
-      <w:pPr>
-        <w:pStyle w:val="Choice"/>
-      </w:pPr>
-      <w:r>
-        <w:t>a)</w:t>
-        <w:tab/>
-        <w:t>Verdadero</w:t>
-      </w:r>
-    </w:p>
-    <w:p>
-      <w:pPr>
-        <w:pStyle w:val="Choice"/>
-      </w:pPr>
-      <w:r>
-        <w:t>b)</w:t>
-        <w:tab/>
-        <w:t>Similar</w:t>
-      </w:r>
-    </w:p>
-    <w:p>
-      <w:pPr>
-        <w:pStyle w:val="ListNumber"/>
-      </w:pPr>
-      <w:r>
-        <w:t>El veteado de la madera es</w:t>
-      </w:r>
-    </w:p>
-    <w:p>
-      <w:pPr>
-        <w:pStyle w:val="Choice"/>
-      </w:pPr>
-      <w:r>
-        <w:t>a)</w:t>
-        <w:tab/>
-        <w:t>Poco apreciado</w:t>
-      </w:r>
-    </w:p>
-    <w:p>
-      <w:pPr>
-        <w:pStyle w:val="Choice"/>
-      </w:pPr>
-      <w:r>
-        <w:t>b)</w:t>
-        <w:tab/>
-        <w:t>Muy apreciado</w:t>
-      </w:r>
-    </w:p>
-    <w:p>
-      <w:pPr>
-        <w:pStyle w:val="Choice"/>
-      </w:pPr>
-      <w:r>
-        <w:t>c)</w:t>
-        <w:tab/>
-        <w:t>Algo que debe esconderse</w:t>
-      </w:r>
-    </w:p>
-    <w:p>
-      <w:pPr>
-        <w:pStyle w:val="Choice"/>
-      </w:pPr>
-      <w:r>
-        <w:t>d)</w:t>
-        <w:tab/>
-        <w:t>La madera no tiene veteado</w:t>
-      </w:r>
-    </w:p>
-    <w:p>
-      <w:pPr>
-        <w:pStyle w:val="ListNumber"/>
-      </w:pPr>
-      <w:r>
-        <w:t>El tablero de contrachapado es</w:t>
-      </w:r>
-    </w:p>
-    <w:p>
-      <w:pPr>
-        <w:pStyle w:val="Choice"/>
-      </w:pPr>
-      <w:r>
-        <w:t>a)</w:t>
-        <w:tab/>
-        <w:t>Un tablero artificial formado por virutas y cola comprimidas</w:t>
-      </w:r>
-    </w:p>
-    <w:p>
-      <w:pPr>
-        <w:pStyle w:val="Choice"/>
-      </w:pPr>
-      <w:r>
-        <w:t>b)</w:t>
-        <w:tab/>
-        <w:t>Un tablero artificial formado por láminas de madera encoladas</w:t>
-      </w:r>
-    </w:p>
-    <w:p>
-      <w:pPr>
-        <w:pStyle w:val="Choice"/>
-      </w:pPr>
-      <w:r>
-        <w:t>c)</w:t>
-        <w:tab/>
-        <w:t>Un tablero artificial formado por fibras de madera y resina sintética</w:t>
-      </w:r>
-    </w:p>
-    <w:p>
-      <w:pPr>
-        <w:pStyle w:val="Choice"/>
-      </w:pPr>
-      <w:r>
-        <w:t>d)</w:t>
-        <w:tab/>
-        <w:t>Un tablero de madera maziza</w:t>
-      </w:r>
-    </w:p>
-    <w:p>
-      <w:pPr>
-        <w:pStyle w:val="ListNumber"/>
-      </w:pPr>
-      <w:r>
-        <w:t>El tablero de aglomerado es</w:t>
-      </w:r>
-    </w:p>
-    <w:p>
-      <w:pPr>
-        <w:pStyle w:val="Choice"/>
-      </w:pPr>
-      <w:r>
-        <w:t>a)</w:t>
-        <w:tab/>
-        <w:t>Un tablero de madera maziza</w:t>
-      </w:r>
-    </w:p>
-    <w:p>
-      <w:pPr>
-        <w:pStyle w:val="Choice"/>
-      </w:pPr>
-      <w:r>
-        <w:t>b)</w:t>
-        <w:tab/>
-        <w:t>Un tablero artificial formado por fibras de madera y resina sintética</w:t>
-      </w:r>
-    </w:p>
-    <w:p>
-      <w:pPr>
-        <w:pStyle w:val="Choice"/>
-      </w:pPr>
-      <w:r>
-        <w:t>c)</w:t>
-        <w:tab/>
-        <w:t>Un tablero artificial formado por virutas y cola comprimidas</w:t>
-      </w:r>
-    </w:p>
-    <w:p>
-      <w:pPr>
-        <w:pStyle w:val="Choice"/>
-      </w:pPr>
-      <w:r>
-        <w:t>d)</w:t>
-        <w:tab/>
-        <w:t>Un tablero artificial formado por láminas de madera encoladas</w:t>
-      </w:r>
-    </w:p>
-    <w:p>
-      <w:pPr>
-        <w:pStyle w:val="ListNumber"/>
-      </w:pPr>
-      <w:r>
-        <w:t>El DM o tablero de fibras es</w:t>
-      </w:r>
-    </w:p>
-    <w:p>
-      <w:pPr>
-        <w:pStyle w:val="Choice"/>
-      </w:pPr>
-      <w:r>
-        <w:t>a)</w:t>
-        <w:tab/>
-        <w:t>Un tablero artificial formado por virutas y cola comprimidas</w:t>
-      </w:r>
-    </w:p>
-    <w:p>
-      <w:pPr>
-        <w:pStyle w:val="Choice"/>
-      </w:pPr>
-      <w:r>
-        <w:t>b)</w:t>
-        <w:tab/>
-        <w:t>Un tablero artificial formado por fibras de madera y resina sintética</w:t>
-      </w:r>
-    </w:p>
-    <w:p>
-      <w:pPr>
-        <w:pStyle w:val="Choice"/>
-      </w:pPr>
-      <w:r>
-        <w:t>c)</w:t>
-        <w:tab/>
-        <w:t>Un tablero artificial formado por láminas de madera encoladas</w:t>
-      </w:r>
-    </w:p>
-    <w:p>
-      <w:pPr>
-        <w:pStyle w:val="Choice"/>
-      </w:pPr>
-      <w:r>
-        <w:t>d)</w:t>
-        <w:tab/>
-        <w:t>Un tablero de madera maziza</w:t>
-      </w:r>
-    </w:p>
-    <w:p>
-      <w:pPr>
-        <w:pStyle w:val="ListNumber"/>
-      </w:pPr>
-      <w:r>
-        <w:t>A los tableros artificiales se les suele pegar en el exterior una  chapa de madera natural o de material plástico.</w:t>
-        <w:br/>
-      </w:r>
-    </w:p>
-    <w:p>
-      <w:pPr>
-        <w:pStyle w:val="Choice"/>
-      </w:pPr>
-      <w:r>
-        <w:t>a)</w:t>
-        <w:tab/>
-        <w:t>Si, aunque eso disminuye la resistencia del tablero</w:t>
-      </w:r>
-    </w:p>
-    <w:p>
-      <w:pPr>
-        <w:pStyle w:val="Choice"/>
-      </w:pPr>
-      <w:r>
-        <w:t>b)</w:t>
-        <w:tab/>
-        <w:t>Si, mejora la resistencia y aspecto del tablero artificial.</w:t>
-      </w:r>
-    </w:p>
-    <w:p>
-      <w:pPr>
-        <w:pStyle w:val="Choice"/>
-      </w:pPr>
-      <w:r>
-        <w:t>c)</w:t>
-        <w:tab/>
-        <w:t>No, los tableros artificiales no se pueden tapar</w:t>
-      </w:r>
-    </w:p>
-    <w:p>
-      <w:pPr>
-        <w:pStyle w:val="Choice"/>
-      </w:pPr>
-      <w:r>
-        <w:t>d)</w:t>
-        <w:tab/>
-        <w:t>No, los tableros artificiales solo se pintan</w:t>
-      </w:r>
-    </w:p>
-    <w:p>
-      <w:pPr>
-        <w:pStyle w:val="ListNumber"/>
-      </w:pPr>
-      <w:r>
-        <w:t>La operación de aserrado de la madera sigue los siguientes pasos</w:t>
-      </w:r>
-    </w:p>
-    <w:p>
-      <w:pPr>
-        <w:pStyle w:val="Choice"/>
-      </w:pPr>
-      <w:r>
-        <w:t>a)</w:t>
-        <w:tab/>
-        <w:t>Medir. Marcar. Sujetar. Serrar</w:t>
-      </w:r>
-    </w:p>
-    <w:p>
-      <w:pPr>
-        <w:pStyle w:val="Choice"/>
-      </w:pPr>
-      <w:r>
-        <w:t>b)</w:t>
-        <w:tab/>
-        <w:t>Marcar. Medir. Sujetar. Serrar</w:t>
-      </w:r>
-    </w:p>
-    <w:p>
-      <w:pPr>
-        <w:pStyle w:val="Choice"/>
-      </w:pPr>
-      <w:r>
-        <w:t>c)</w:t>
-        <w:tab/>
-        <w:t>Medir. Marcar. Serrar. Sujetar</w:t>
-      </w:r>
-    </w:p>
-    <w:p>
-      <w:pPr>
-        <w:pStyle w:val="Choice"/>
-      </w:pPr>
-      <w:r>
-        <w:t>d)</w:t>
-        <w:tab/>
-        <w:t>Serrar. Pulir. Pintar</w:t>
-      </w:r>
-    </w:p>
-    <w:p>
-      <w:pPr>
-        <w:pStyle w:val="ListNumber"/>
-      </w:pPr>
-      <w:r>
-        <w:t>La operación que consiste en la separación de las piezas de madera se llama</w:t>
-      </w:r>
-    </w:p>
-    <w:p>
-      <w:pPr>
-        <w:pStyle w:val="Choice"/>
-      </w:pPr>
-      <w:r>
-        <w:t>a)</w:t>
-        <w:tab/>
-        <w:t>Corte</w:t>
-      </w:r>
-    </w:p>
-    <w:p>
-      <w:pPr>
-        <w:pStyle w:val="Choice"/>
-      </w:pPr>
-      <w:r>
-        <w:t>b)</w:t>
-        <w:tab/>
-        <w:t>Talado</w:t>
-      </w:r>
-    </w:p>
-    <w:p>
-      <w:pPr>
-        <w:pStyle w:val="Choice"/>
-      </w:pPr>
-      <w:r>
-        <w:t>c)</w:t>
-        <w:tab/>
-        <w:t>Aserrado</w:t>
-      </w:r>
-    </w:p>
-    <w:p>
-      <w:pPr>
-        <w:pStyle w:val="Choice"/>
-      </w:pPr>
-      <w:r>
-        <w:t>d)</w:t>
-        <w:tab/>
-        <w:t>Separado</w:t>
-      </w:r>
-    </w:p>
-    <w:p>
-      <w:pPr>
-        <w:pStyle w:val="ListNumber"/>
-      </w:pPr>
-      <w:r>
         <w:t>La operación de eliminar material de una pieza de madera para afinar su forma o quitar las asperezas se denomina.</w:t>
       </w:r>
     </w:p>
@@ -1157,6 +1157,16 @@
       </w:pPr>
       <w:r>
         <w:t>a)</w:t>
+        <w:tab/>
+        <w:t>Amolar</w:t>
+      </w:r>
+    </w:p>
+    <w:p>
+      <w:pPr>
+        <w:pStyle w:val="Choice"/>
+      </w:pPr>
+      <w:r>
+        <w:t>b)</w:t>
         <w:tab/>
         <w:t>Alisar</w:t>
       </w:r>
@@ -1166,19 +1176,9 @@
         <w:pStyle w:val="Choice"/>
       </w:pPr>
       <w:r>
-        <w:t>b)</w:t>
+        <w:t>c)</w:t>
         <w:tab/>
         <w:t>Pulir</w:t>
-      </w:r>
-    </w:p>
-    <w:p>
-      <w:pPr>
-        <w:pStyle w:val="Choice"/>
-      </w:pPr>
-      <w:r>
-        <w:t>c)</w:t>
-        <w:tab/>
-        <w:t>Amolar</w:t>
       </w:r>
     </w:p>
     <w:p>
@@ -1206,7 +1206,7 @@
       <w:r>
         <w:t>a)</w:t>
         <w:tab/>
-        <w:t>Lijar o pulir</w:t>
+        <w:t>Amolar</w:t>
       </w:r>
     </w:p>
     <w:p>
@@ -1226,7 +1226,7 @@
       <w:r>
         <w:t>c)</w:t>
         <w:tab/>
-        <w:t>Amolar</w:t>
+        <w:t>Lijar o pulir</w:t>
       </w:r>
     </w:p>
     <w:p>
@@ -1254,6 +1254,16 @@
       <w:r>
         <w:t>a)</w:t>
         <w:tab/>
+        <w:t>Primero de numeración baja y luego de numeración alta</w:t>
+      </w:r>
+    </w:p>
+    <w:p>
+      <w:pPr>
+        <w:pStyle w:val="Choice"/>
+      </w:pPr>
+      <w:r>
+        <w:t>b)</w:t>
+        <w:tab/>
         <w:t>Directamente de numeración alta</w:t>
       </w:r>
     </w:p>
@@ -1262,9 +1272,9 @@
         <w:pStyle w:val="Choice"/>
       </w:pPr>
       <w:r>
-        <w:t>b)</w:t>
+        <w:t>c)</w:t>
         <w:tab/>
-        <w:t>Primero de numeración baja y luego de numeración alta</w:t>
+        <w:t>Primero de numeración alta y luego de numeración baja</w:t>
       </w:r>
     </w:p>
     <w:p>
@@ -1272,19 +1282,249 @@
         <w:pStyle w:val="Choice"/>
       </w:pPr>
       <w:r>
-        <w:t>c)</w:t>
+        <w:t>d)</w:t>
         <w:tab/>
         <w:t>De numeración baja</w:t>
       </w:r>
     </w:p>
     <w:p>
       <w:pPr>
+        <w:pStyle w:val="ListNumber"/>
+      </w:pPr>
+      <w:r>
+        <w:t>Practicar agujeros sobre la pieza de madera con una broca es</w:t>
+      </w:r>
+    </w:p>
+    <w:p>
+      <w:pPr>
+        <w:pStyle w:val="Choice"/>
+      </w:pPr>
+      <w:r>
+        <w:t>a)</w:t>
+        <w:tab/>
+        <w:t>Clavar la madera</w:t>
+      </w:r>
+    </w:p>
+    <w:p>
+      <w:pPr>
+        <w:pStyle w:val="Choice"/>
+      </w:pPr>
+      <w:r>
+        <w:t>b)</w:t>
+        <w:tab/>
+        <w:t>Taladrar la madera</w:t>
+      </w:r>
+    </w:p>
+    <w:p>
+      <w:pPr>
+        <w:pStyle w:val="Choice"/>
+      </w:pPr>
+      <w:r>
+        <w:t>c)</w:t>
+        <w:tab/>
+        <w:t>Agujerear la madera</w:t>
+      </w:r>
+    </w:p>
+    <w:p>
+      <w:pPr>
         <w:pStyle w:val="Choice"/>
       </w:pPr>
       <w:r>
         <w:t>d)</w:t>
         <w:tab/>
-        <w:t>Primero de numeración alta y luego de numeración baja</w:t>
+        <w:t>Troquelar la madera</w:t>
+      </w:r>
+    </w:p>
+    <w:p>
+      <w:pPr>
+        <w:pStyle w:val="ListNumber"/>
+      </w:pPr>
+      <w:r>
+        <w:t>Para unir dos maderas de forma permanente podemos usar</w:t>
+      </w:r>
+    </w:p>
+    <w:p>
+      <w:pPr>
+        <w:pStyle w:val="Choice"/>
+      </w:pPr>
+      <w:r>
+        <w:t>a)</w:t>
+        <w:tab/>
+        <w:t>Clavos</w:t>
+      </w:r>
+    </w:p>
+    <w:p>
+      <w:pPr>
+        <w:pStyle w:val="Choice"/>
+      </w:pPr>
+      <w:r>
+        <w:t>b)</w:t>
+        <w:tab/>
+        <w:t>Tornillos</w:t>
+      </w:r>
+    </w:p>
+    <w:p>
+      <w:pPr>
+        <w:pStyle w:val="Choice"/>
+      </w:pPr>
+      <w:r>
+        <w:t>c)</w:t>
+        <w:tab/>
+        <w:t>Cola blanca</w:t>
+      </w:r>
+    </w:p>
+    <w:p>
+      <w:pPr>
+        <w:pStyle w:val="Choice"/>
+      </w:pPr>
+      <w:r>
+        <w:t>d)</w:t>
+        <w:tab/>
+        <w:t>Ensambles</w:t>
+      </w:r>
+    </w:p>
+    <w:p>
+      <w:pPr>
+        <w:pStyle w:val="ListNumber"/>
+      </w:pPr>
+      <w:r>
+        <w:t>Para unir la madera de forma no permanente podemos usar</w:t>
+      </w:r>
+    </w:p>
+    <w:p>
+      <w:pPr>
+        <w:pStyle w:val="Choice"/>
+      </w:pPr>
+      <w:r>
+        <w:t>a)</w:t>
+        <w:tab/>
+        <w:t>Tornillos</w:t>
+      </w:r>
+    </w:p>
+    <w:p>
+      <w:pPr>
+        <w:pStyle w:val="Choice"/>
+      </w:pPr>
+      <w:r>
+        <w:t>b)</w:t>
+        <w:tab/>
+        <w:t>Cola termofusible</w:t>
+      </w:r>
+    </w:p>
+    <w:p>
+      <w:pPr>
+        <w:pStyle w:val="Choice"/>
+      </w:pPr>
+      <w:r>
+        <w:t>c)</w:t>
+        <w:tab/>
+        <w:t>Pegamento de contacto</w:t>
+      </w:r>
+    </w:p>
+    <w:p>
+      <w:pPr>
+        <w:pStyle w:val="Choice"/>
+      </w:pPr>
+      <w:r>
+        <w:t>d)</w:t>
+        <w:tab/>
+        <w:t>Cola blanda</w:t>
+      </w:r>
+    </w:p>
+    <w:p>
+      <w:pPr>
+        <w:pStyle w:val="ListNumber"/>
+      </w:pPr>
+      <w:r>
+        <w:t>Esta herramienta se llama</w:t>
+      </w:r>
+    </w:p>
+    <w:p>
+      <w:pPr>
+        <w:pStyle w:val="Choice"/>
+      </w:pPr>
+      <w:r>
+        <w:t>a)</w:t>
+        <w:tab/>
+        <w:t>Punzón</w:t>
+      </w:r>
+    </w:p>
+    <w:p>
+      <w:pPr>
+        <w:pStyle w:val="Choice"/>
+      </w:pPr>
+      <w:r>
+        <w:t>b)</w:t>
+        <w:tab/>
+        <w:t>Destornillador</w:t>
+      </w:r>
+    </w:p>
+    <w:p>
+      <w:pPr>
+        <w:pStyle w:val="Choice"/>
+      </w:pPr>
+      <w:r>
+        <w:t>c)</w:t>
+        <w:tab/>
+        <w:t>Atornillador</w:t>
+      </w:r>
+    </w:p>
+    <w:p>
+      <w:pPr>
+        <w:pStyle w:val="Choice"/>
+      </w:pPr>
+      <w:r>
+        <w:t>d)</w:t>
+        <w:tab/>
+        <w:t>Escofina</w:t>
+      </w:r>
+    </w:p>
+    <w:p>
+      <w:pPr>
+        <w:pStyle w:val="ListNumber"/>
+      </w:pPr>
+      <w:r>
+        <w:t>Esta herramienta se llama</w:t>
+      </w:r>
+    </w:p>
+    <w:p>
+      <w:pPr>
+        <w:pStyle w:val="Choice"/>
+      </w:pPr>
+      <w:r>
+        <w:t>a)</w:t>
+        <w:tab/>
+        <w:t>Martillador</w:t>
+      </w:r>
+    </w:p>
+    <w:p>
+      <w:pPr>
+        <w:pStyle w:val="Choice"/>
+      </w:pPr>
+      <w:r>
+        <w:t>b)</w:t>
+        <w:tab/>
+        <w:t>Clavador</w:t>
+      </w:r>
+    </w:p>
+    <w:p>
+      <w:pPr>
+        <w:pStyle w:val="Choice"/>
+      </w:pPr>
+      <w:r>
+        <w:t>c)</w:t>
+        <w:tab/>
+        <w:t>Martillo</w:t>
+      </w:r>
+    </w:p>
+    <w:p>
+      <w:pPr>
+        <w:pStyle w:val="Choice"/>
+      </w:pPr>
+      <w:r>
+        <w:t>d)</w:t>
+        <w:tab/>
+        <w:t>Amartillador</w:t>
       </w:r>
     </w:p>
     <w:sectPr>

</xml_diff>

<commit_message>
Corrección de una respuesta
</commit_message>
<xml_diff>
--- a/build/es_material_wood.docx
+++ b/build/es_material_wood.docx
@@ -35,6 +35,16 @@
       <w:r>
         <w:t>b)</w:t>
         <w:tab/>
+        <w:t>Parecida a la densidad del agua</w:t>
+      </w:r>
+    </w:p>
+    <w:p>
+      <w:pPr>
+        <w:pStyle w:val="Choice"/>
+      </w:pPr>
+      <w:r>
+        <w:t>c)</w:t>
+        <w:tab/>
         <w:t>Mucho menor que la densidad del agua</w:t>
       </w:r>
     </w:p>
@@ -43,23 +53,13 @@
         <w:pStyle w:val="Choice"/>
       </w:pPr>
       <w:r>
-        <w:t>c)</w:t>
+        <w:t>d)</w:t>
         <w:tab/>
         <w:t>La madera no tiene densidad</w:t>
       </w:r>
     </w:p>
     <w:p>
       <w:pPr>
-        <w:pStyle w:val="Choice"/>
-      </w:pPr>
-      <w:r>
-        <w:t>d)</w:t>
-        <w:tab/>
-        <w:t>Parecida a la densidad del agua</w:t>
-      </w:r>
-    </w:p>
-    <w:p>
-      <w:pPr>
         <w:pStyle w:val="ListNumber"/>
       </w:pPr>
       <w:r>
@@ -73,7 +73,7 @@
       <w:r>
         <w:t>a)</w:t>
         <w:tab/>
-        <w:t>La madera no se debe mojar con agua</w:t>
+        <w:t>La madera siempre se hunde en el agua</w:t>
       </w:r>
     </w:p>
     <w:p>
@@ -82,6 +82,16 @@
       </w:pPr>
       <w:r>
         <w:t>b)</w:t>
+        <w:tab/>
+        <w:t>Algunas maderas flotan y otras se hunden</w:t>
+      </w:r>
+    </w:p>
+    <w:p>
+      <w:pPr>
+        <w:pStyle w:val="Choice"/>
+      </w:pPr>
+      <w:r>
+        <w:t>c)</w:t>
         <w:tab/>
         <w:t>La madera siempre flota en el agua</w:t>
       </w:r>
@@ -91,19 +101,9 @@
         <w:pStyle w:val="Choice"/>
       </w:pPr>
       <w:r>
-        <w:t>c)</w:t>
-        <w:tab/>
-        <w:t>Algunas maderas flotan y otras se hunden</w:t>
-      </w:r>
-    </w:p>
-    <w:p>
-      <w:pPr>
-        <w:pStyle w:val="Choice"/>
-      </w:pPr>
-      <w:r>
         <w:t>d)</w:t>
         <w:tab/>
-        <w:t>La madera siempre se hunde en el agua</w:t>
+        <w:t>La madera no se debe mojar con agua</w:t>
       </w:r>
     </w:p>
     <w:p>
@@ -121,6 +121,16 @@
       <w:r>
         <w:t>a)</w:t>
         <w:tab/>
+        <w:t>Conduce bien el calor pero mal la electricidad</w:t>
+      </w:r>
+    </w:p>
+    <w:p>
+      <w:pPr>
+        <w:pStyle w:val="Choice"/>
+      </w:pPr>
+      <w:r>
+        <w:t>b)</w:t>
+        <w:tab/>
         <w:t>Conduce bien la electricidad pero mal el calor</w:t>
       </w:r>
     </w:p>
@@ -129,33 +139,23 @@
         <w:pStyle w:val="Choice"/>
       </w:pPr>
       <w:r>
-        <w:t>b)</w:t>
+        <w:t>c)</w:t>
+        <w:tab/>
+        <w:t>Es buen aislante eléctrico y térmico</w:t>
+      </w:r>
+    </w:p>
+    <w:p>
+      <w:pPr>
+        <w:pStyle w:val="Choice"/>
+      </w:pPr>
+      <w:r>
+        <w:t>d)</w:t>
         <w:tab/>
         <w:t>Conduce bien el calor y la electricidad</w:t>
       </w:r>
     </w:p>
     <w:p>
       <w:pPr>
-        <w:pStyle w:val="Choice"/>
-      </w:pPr>
-      <w:r>
-        <w:t>c)</w:t>
-        <w:tab/>
-        <w:t>Conduce bien el calor pero mal la electricidad</w:t>
-      </w:r>
-    </w:p>
-    <w:p>
-      <w:pPr>
-        <w:pStyle w:val="Choice"/>
-      </w:pPr>
-      <w:r>
-        <w:t>d)</w:t>
-        <w:tab/>
-        <w:t>Es buen aislante eléctrico y térmico</w:t>
-      </w:r>
-    </w:p>
-    <w:p>
-      <w:pPr>
         <w:pStyle w:val="ListNumber"/>
       </w:pPr>
       <w:r>
@@ -169,7 +169,7 @@
       <w:r>
         <w:t>a)</w:t>
         <w:tab/>
-        <w:t>Porque es muy flexible</w:t>
+        <w:t>Porque el agua puede pudrirla</w:t>
       </w:r>
     </w:p>
     <w:p>
@@ -189,7 +189,7 @@
       <w:r>
         <w:t>c)</w:t>
         <w:tab/>
-        <w:t>Porque el agua puede pudrirla</w:t>
+        <w:t>Porque absorbe bien la humedad y el agua</w:t>
       </w:r>
     </w:p>
     <w:p>
@@ -199,7 +199,7 @@
       <w:r>
         <w:t>d)</w:t>
         <w:tab/>
-        <w:t>Porque absorbe bien la humedad y el agua</w:t>
+        <w:t>Porque es muy flexible</w:t>
       </w:r>
     </w:p>
     <w:p>
@@ -217,7 +217,7 @@
       <w:r>
         <w:t>a)</w:t>
         <w:tab/>
-        <w:t>No es renovable</w:t>
+        <w:t>Si, si se repueblan los bosques talados</w:t>
       </w:r>
     </w:p>
     <w:p>
@@ -227,7 +227,7 @@
       <w:r>
         <w:t>b)</w:t>
         <w:tab/>
-        <w:t>Si, si se repueblan los bosques talados</w:t>
+        <w:t>No es renovable</w:t>
       </w:r>
     </w:p>
     <w:p>
@@ -265,6 +265,16 @@
       <w:r>
         <w:t>a)</w:t>
         <w:tab/>
+        <w:t>Si, porque soporta bien los golpes sin romperse</w:t>
+      </w:r>
+    </w:p>
+    <w:p>
+      <w:pPr>
+        <w:pStyle w:val="Choice"/>
+      </w:pPr>
+      <w:r>
+        <w:t>b)</w:t>
+        <w:tab/>
         <w:t>No, es blanda</w:t>
       </w:r>
     </w:p>
@@ -273,7 +283,7 @@
         <w:pStyle w:val="Choice"/>
       </w:pPr>
       <w:r>
-        <w:t>b)</w:t>
+        <w:t>c)</w:t>
         <w:tab/>
         <w:t>Si, porque tiene buena resistencia mecánica</w:t>
       </w:r>
@@ -283,23 +293,13 @@
         <w:pStyle w:val="Choice"/>
       </w:pPr>
       <w:r>
-        <w:t>c)</w:t>
+        <w:t>d)</w:t>
         <w:tab/>
         <w:t>Si, porque soporta bien que la intenten rayar</w:t>
       </w:r>
     </w:p>
     <w:p>
       <w:pPr>
-        <w:pStyle w:val="Choice"/>
-      </w:pPr>
-      <w:r>
-        <w:t>d)</w:t>
-        <w:tab/>
-        <w:t>Si, porque soporta bien los golpes sin romperse</w:t>
-      </w:r>
-    </w:p>
-    <w:p>
-      <w:pPr>
         <w:pStyle w:val="ListNumber"/>
       </w:pPr>
       <w:r>
@@ -313,7 +313,7 @@
       <w:r>
         <w:t>a)</w:t>
         <w:tab/>
-        <w:t>Es la parte exterior del tronco</w:t>
+        <w:t>Es la parte exterior del tronco o corteza</w:t>
       </w:r>
     </w:p>
     <w:p>
@@ -323,7 +323,7 @@
       <w:r>
         <w:t>b)</w:t>
         <w:tab/>
-        <w:t>Es todo el interior del tronco excepto la corteza</w:t>
+        <w:t>Es la parte exterior del tronco, más joven y de color más claro</w:t>
       </w:r>
     </w:p>
     <w:p>
@@ -333,7 +333,7 @@
       <w:r>
         <w:t>c)</w:t>
         <w:tab/>
-        <w:t>Es la parte exterior del tronco, más joven y de color más claro</w:t>
+        <w:t>Es todo el interior del tronco excepto la corteza</w:t>
       </w:r>
     </w:p>
     <w:p>
@@ -361,7 +361,7 @@
       <w:r>
         <w:t>a)</w:t>
         <w:tab/>
-        <w:t>Es la parte exterior del tronco, más joven y de color más claro</w:t>
+        <w:t>Es todo el interior del tronco excepto la corteza</w:t>
       </w:r>
     </w:p>
     <w:p>
@@ -371,7 +371,7 @@
       <w:r>
         <w:t>b)</w:t>
         <w:tab/>
-        <w:t>Es todo el interior del tronco excepto la corteza</w:t>
+        <w:t>Es la parte exterior del tronco, más joven y de color más claro</w:t>
       </w:r>
     </w:p>
     <w:p>
@@ -409,6 +409,16 @@
       <w:r>
         <w:t>a)</w:t>
         <w:tab/>
+        <w:t>La corteza del alcornoque es corcho, que tiene muchas aplicaciones</w:t>
+      </w:r>
+    </w:p>
+    <w:p>
+      <w:pPr>
+        <w:pStyle w:val="Choice"/>
+      </w:pPr>
+      <w:r>
+        <w:t>b)</w:t>
+        <w:tab/>
         <w:t>La albura se puede aprovechar en ciertas maderas</w:t>
       </w:r>
     </w:p>
@@ -417,19 +427,9 @@
         <w:pStyle w:val="Choice"/>
       </w:pPr>
       <w:r>
-        <w:t>b)</w:t>
+        <w:t>c)</w:t>
         <w:tab/>
         <w:t>El duramen del tronco se aprovecha para hacer serrin</w:t>
-      </w:r>
-    </w:p>
-    <w:p>
-      <w:pPr>
-        <w:pStyle w:val="Choice"/>
-      </w:pPr>
-      <w:r>
-        <w:t>c)</w:t>
-        <w:tab/>
-        <w:t>La corteza del alcornoque es corcho, que tiene muchas aplicaciones</w:t>
       </w:r>
     </w:p>
     <w:p>
@@ -467,7 +467,7 @@
       <w:r>
         <w:t>b)</w:t>
         <w:tab/>
-        <w:t>Tala del árbol</w:t>
+        <w:t>Ninguna es correcta</w:t>
       </w:r>
     </w:p>
     <w:p>
@@ -477,7 +477,7 @@
       <w:r>
         <w:t>c)</w:t>
         <w:tab/>
-        <w:t>Ninguna es correcta</w:t>
+        <w:t>Tala del árbol</w:t>
       </w:r>
     </w:p>
     <w:p>
@@ -505,6 +505,16 @@
       <w:r>
         <w:t>a)</w:t>
         <w:tab/>
+        <w:t>Asierrado</w:t>
+      </w:r>
+    </w:p>
+    <w:p>
+      <w:pPr>
+        <w:pStyle w:val="Choice"/>
+      </w:pPr>
+      <w:r>
+        <w:t>b)</w:t>
+        <w:tab/>
         <w:t>Aserrado</w:t>
       </w:r>
     </w:p>
@@ -513,19 +523,57 @@
         <w:pStyle w:val="Choice"/>
       </w:pPr>
       <w:r>
-        <w:t>b)</w:t>
+        <w:t>c)</w:t>
+        <w:tab/>
+        <w:t>Recortado</w:t>
+      </w:r>
+    </w:p>
+    <w:p>
+      <w:pPr>
+        <w:pStyle w:val="Choice"/>
+      </w:pPr>
+      <w:r>
+        <w:t>d)</w:t>
         <w:tab/>
         <w:t>Tala</w:t>
       </w:r>
     </w:p>
     <w:p>
       <w:pPr>
+        <w:pStyle w:val="ListNumber"/>
+      </w:pPr>
+      <w:r>
+        <w:t>¿Cómo se llama una tira fina de madera de sección rectangular o redonda?</w:t>
+      </w:r>
+    </w:p>
+    <w:p>
+      <w:pPr>
+        <w:pStyle w:val="Choice"/>
+      </w:pPr>
+      <w:r>
+        <w:t>a)</w:t>
+        <w:tab/>
+        <w:t>Tablón</w:t>
+      </w:r>
+    </w:p>
+    <w:p>
+      <w:pPr>
+        <w:pStyle w:val="Choice"/>
+      </w:pPr>
+      <w:r>
+        <w:t>b)</w:t>
+        <w:tab/>
+        <w:t>Viga</w:t>
+      </w:r>
+    </w:p>
+    <w:p>
+      <w:pPr>
         <w:pStyle w:val="Choice"/>
       </w:pPr>
       <w:r>
         <w:t>c)</w:t>
         <w:tab/>
-        <w:t>Asierrado</w:t>
+        <w:t>Tabla</w:t>
       </w:r>
     </w:p>
     <w:p>
@@ -535,7 +583,7 @@
       <w:r>
         <w:t>d)</w:t>
         <w:tab/>
-        <w:t>Recortado</w:t>
+        <w:t>Listones</w:t>
       </w:r>
     </w:p>
     <w:p>
@@ -543,7 +591,7 @@
         <w:pStyle w:val="ListNumber"/>
       </w:pPr>
       <w:r>
-        <w:t>¿Cómo se llama una tira fina de madera de sección rectangular o redonda?</w:t>
+        <w:t>¿Cómo se llama una madera de grandes dimensiones de forma rectangular?</w:t>
       </w:r>
     </w:p>
     <w:p>
@@ -563,7 +611,7 @@
       <w:r>
         <w:t>b)</w:t>
         <w:tab/>
-        <w:t>Viga</w:t>
+        <w:t>Tablero</w:t>
       </w:r>
     </w:p>
     <w:p>
@@ -573,7 +621,7 @@
       <w:r>
         <w:t>c)</w:t>
         <w:tab/>
-        <w:t>Tablón</w:t>
+        <w:t>Viga</w:t>
       </w:r>
     </w:p>
     <w:p>
@@ -591,7 +639,7 @@
         <w:pStyle w:val="ListNumber"/>
       </w:pPr>
       <w:r>
-        <w:t>¿Cómo se llama una madera de grandes dimensiones de forma rectangular?</w:t>
+        <w:t>¿Cómo se llama una madera plana de gran superficie y poco gruesa?</w:t>
       </w:r>
     </w:p>
     <w:p>
@@ -601,7 +649,7 @@
       <w:r>
         <w:t>a)</w:t>
         <w:tab/>
-        <w:t>Tabla</w:t>
+        <w:t>Moldura</w:t>
       </w:r>
     </w:p>
     <w:p>
@@ -621,54 +669,6 @@
       <w:r>
         <w:t>c)</w:t>
         <w:tab/>
-        <w:t>Listones</w:t>
-      </w:r>
-    </w:p>
-    <w:p>
-      <w:pPr>
-        <w:pStyle w:val="Choice"/>
-      </w:pPr>
-      <w:r>
-        <w:t>d)</w:t>
-        <w:tab/>
-        <w:t>Tablero</w:t>
-      </w:r>
-    </w:p>
-    <w:p>
-      <w:pPr>
-        <w:pStyle w:val="ListNumber"/>
-      </w:pPr>
-      <w:r>
-        <w:t>¿Cómo se llama una madera plana de gran superficie y poco gruesa?</w:t>
-      </w:r>
-    </w:p>
-    <w:p>
-      <w:pPr>
-        <w:pStyle w:val="Choice"/>
-      </w:pPr>
-      <w:r>
-        <w:t>a)</w:t>
-        <w:tab/>
-        <w:t>Tablón</w:t>
-      </w:r>
-    </w:p>
-    <w:p>
-      <w:pPr>
-        <w:pStyle w:val="Choice"/>
-      </w:pPr>
-      <w:r>
-        <w:t>b)</w:t>
-        <w:tab/>
-        <w:t>Viga</w:t>
-      </w:r>
-    </w:p>
-    <w:p>
-      <w:pPr>
-        <w:pStyle w:val="Choice"/>
-      </w:pPr>
-      <w:r>
-        <w:t>c)</w:t>
-        <w:tab/>
         <w:t>Chapa o tablero</w:t>
       </w:r>
     </w:p>
@@ -679,7 +679,7 @@
       <w:r>
         <w:t>d)</w:t>
         <w:tab/>
-        <w:t>Moldura</w:t>
+        <w:t>Tablón</w:t>
       </w:r>
     </w:p>
     <w:p>
@@ -745,6 +745,16 @@
       <w:r>
         <w:t>a)</w:t>
         <w:tab/>
+        <w:t>Chopo</w:t>
+      </w:r>
+    </w:p>
+    <w:p>
+      <w:pPr>
+        <w:pStyle w:val="Choice"/>
+      </w:pPr>
+      <w:r>
+        <w:t>b)</w:t>
+        <w:tab/>
         <w:t>Roble</w:t>
       </w:r>
     </w:p>
@@ -753,7 +763,7 @@
         <w:pStyle w:val="Choice"/>
       </w:pPr>
       <w:r>
-        <w:t>b)</w:t>
+        <w:t>c)</w:t>
         <w:tab/>
         <w:t>Haya</w:t>
       </w:r>
@@ -763,19 +773,9 @@
         <w:pStyle w:val="Choice"/>
       </w:pPr>
       <w:r>
-        <w:t>c)</w:t>
+        <w:t>d)</w:t>
         <w:tab/>
         <w:t>Castaño</w:t>
-      </w:r>
-    </w:p>
-    <w:p>
-      <w:pPr>
-        <w:pStyle w:val="Choice"/>
-      </w:pPr>
-      <w:r>
-        <w:t>d)</w:t>
-        <w:tab/>
-        <w:t>Chopo</w:t>
       </w:r>
     </w:p>
     <w:p>
@@ -831,7 +831,7 @@
       <w:r>
         <w:t>b)</w:t>
         <w:tab/>
-        <w:t>Muy apreciado</w:t>
+        <w:t>La madera no tiene veteado</w:t>
       </w:r>
     </w:p>
     <w:p>
@@ -841,7 +841,7 @@
       <w:r>
         <w:t>c)</w:t>
         <w:tab/>
-        <w:t>La madera no tiene veteado</w:t>
+        <w:t>Muy apreciado</w:t>
       </w:r>
     </w:p>
     <w:p>
@@ -869,7 +869,7 @@
       <w:r>
         <w:t>a)</w:t>
         <w:tab/>
-        <w:t>Un tablero artificial formado por virutas y cola comprimidas</w:t>
+        <w:t>Un tablero artificial formado por fibras de madera y resina sintética</w:t>
       </w:r>
     </w:p>
     <w:p>
@@ -879,7 +879,7 @@
       <w:r>
         <w:t>b)</w:t>
         <w:tab/>
-        <w:t>Un tablero de madera maziza</w:t>
+        <w:t>Un tablero artificial formado por virutas y cola comprimidas</w:t>
       </w:r>
     </w:p>
     <w:p>
@@ -899,7 +899,7 @@
       <w:r>
         <w:t>d)</w:t>
         <w:tab/>
-        <w:t>Un tablero artificial formado por fibras de madera y resina sintética</w:t>
+        <w:t>Un tablero de madera maziza</w:t>
       </w:r>
     </w:p>
     <w:p>
@@ -917,7 +917,55 @@
       <w:r>
         <w:t>a)</w:t>
         <w:tab/>
+        <w:t>Un tablero artificial formado por virutas y cola comprimidas</w:t>
+      </w:r>
+    </w:p>
+    <w:p>
+      <w:pPr>
+        <w:pStyle w:val="Choice"/>
+      </w:pPr>
+      <w:r>
+        <w:t>b)</w:t>
+        <w:tab/>
+        <w:t>Un tablero artificial formado por fibras de madera y resina sintética</w:t>
+      </w:r>
+    </w:p>
+    <w:p>
+      <w:pPr>
+        <w:pStyle w:val="Choice"/>
+      </w:pPr>
+      <w:r>
+        <w:t>c)</w:t>
+        <w:tab/>
+        <w:t>Un tablero artificial formado por láminas de madera encoladas</w:t>
+      </w:r>
+    </w:p>
+    <w:p>
+      <w:pPr>
+        <w:pStyle w:val="Choice"/>
+      </w:pPr>
+      <w:r>
+        <w:t>d)</w:t>
+        <w:tab/>
         <w:t>Un tablero de madera maziza</w:t>
+      </w:r>
+    </w:p>
+    <w:p>
+      <w:pPr>
+        <w:pStyle w:val="ListNumber"/>
+      </w:pPr>
+      <w:r>
+        <w:t>El DM o tablero de fibras es</w:t>
+      </w:r>
+    </w:p>
+    <w:p>
+      <w:pPr>
+        <w:pStyle w:val="Choice"/>
+      </w:pPr>
+      <w:r>
+        <w:t>a)</w:t>
+        <w:tab/>
+        <w:t>Un tablero artificial formado por fibras de madera y resina sintética</w:t>
       </w:r>
     </w:p>
     <w:p>
@@ -937,65 +985,17 @@
       <w:r>
         <w:t>c)</w:t>
         <w:tab/>
-        <w:t>Un tablero artificial formado por fibras de madera y resina sintética</w:t>
-      </w:r>
-    </w:p>
-    <w:p>
-      <w:pPr>
-        <w:pStyle w:val="Choice"/>
-      </w:pPr>
-      <w:r>
-        <w:t>d)</w:t>
-        <w:tab/>
         <w:t>Un tablero artificial formado por láminas de madera encoladas</w:t>
       </w:r>
     </w:p>
     <w:p>
       <w:pPr>
-        <w:pStyle w:val="ListNumber"/>
-      </w:pPr>
-      <w:r>
-        <w:t>El DM o tablero de fibras es</w:t>
-      </w:r>
-    </w:p>
-    <w:p>
-      <w:pPr>
-        <w:pStyle w:val="Choice"/>
-      </w:pPr>
-      <w:r>
-        <w:t>a)</w:t>
-        <w:tab/>
-        <w:t>Un tablero de madera maziza</w:t>
-      </w:r>
-    </w:p>
-    <w:p>
-      <w:pPr>
-        <w:pStyle w:val="Choice"/>
-      </w:pPr>
-      <w:r>
-        <w:t>b)</w:t>
-        <w:tab/>
-        <w:t>Un tablero artificial formado por virutas y cola comprimidas</w:t>
-      </w:r>
-    </w:p>
-    <w:p>
-      <w:pPr>
-        <w:pStyle w:val="Choice"/>
-      </w:pPr>
-      <w:r>
-        <w:t>c)</w:t>
-        <w:tab/>
-        <w:t>Un tablero artificial formado por láminas de madera encoladas</w:t>
-      </w:r>
-    </w:p>
-    <w:p>
-      <w:pPr>
         <w:pStyle w:val="Choice"/>
       </w:pPr>
       <w:r>
         <w:t>d)</w:t>
         <w:tab/>
-        <w:t>Un tablero artificial formado por fibras de madera y resina sintética</w:t>
+        <w:t>Un tablero de madera maziza</w:t>
       </w:r>
     </w:p>
     <w:p>
@@ -1014,16 +1014,6 @@
       <w:r>
         <w:t>a)</w:t>
         <w:tab/>
-        <w:t>No, los tableros artificiales solo se pintan</w:t>
-      </w:r>
-    </w:p>
-    <w:p>
-      <w:pPr>
-        <w:pStyle w:val="Choice"/>
-      </w:pPr>
-      <w:r>
-        <w:t>b)</w:t>
-        <w:tab/>
         <w:t>No, los tableros artificiales no se pueden tapar</w:t>
       </w:r>
     </w:p>
@@ -1032,9 +1022,19 @@
         <w:pStyle w:val="Choice"/>
       </w:pPr>
       <w:r>
+        <w:t>b)</w:t>
+        <w:tab/>
+        <w:t>Si, mejora la resistencia y aspecto del tablero artificial</w:t>
+      </w:r>
+    </w:p>
+    <w:p>
+      <w:pPr>
+        <w:pStyle w:val="Choice"/>
+      </w:pPr>
+      <w:r>
         <w:t>c)</w:t>
         <w:tab/>
-        <w:t>Si, mejora la resistencia y aspecto del tablero artificial</w:t>
+        <w:t>No, los tableros artificiales solo se pintan</w:t>
       </w:r>
     </w:p>
     <w:p>
@@ -1072,16 +1072,6 @@
       <w:r>
         <w:t>b)</w:t>
         <w:tab/>
-        <w:t>Medir. Marcar. Sujetar. Serrar</w:t>
-      </w:r>
-    </w:p>
-    <w:p>
-      <w:pPr>
-        <w:pStyle w:val="Choice"/>
-      </w:pPr>
-      <w:r>
-        <w:t>c)</w:t>
-        <w:tab/>
         <w:t>Marcar. Medir. Sujetar. Serrar</w:t>
       </w:r>
     </w:p>
@@ -1090,9 +1080,19 @@
         <w:pStyle w:val="Choice"/>
       </w:pPr>
       <w:r>
+        <w:t>c)</w:t>
+        <w:tab/>
+        <w:t>Serrar. Pulir. Pintar</w:t>
+      </w:r>
+    </w:p>
+    <w:p>
+      <w:pPr>
+        <w:pStyle w:val="Choice"/>
+      </w:pPr>
+      <w:r>
         <w:t>d)</w:t>
         <w:tab/>
-        <w:t>Serrar. Pulir. Pintar</w:t>
+        <w:t>Medir. Marcar. Sujetar. Serrar</w:t>
       </w:r>
     </w:p>
     <w:p>
@@ -1120,7 +1120,7 @@
       <w:r>
         <w:t>b)</w:t>
         <w:tab/>
-        <w:t>Aserrado</w:t>
+        <w:t>Separado</w:t>
       </w:r>
     </w:p>
     <w:p>
@@ -1140,7 +1140,7 @@
       <w:r>
         <w:t>d)</w:t>
         <w:tab/>
-        <w:t>Separado</w:t>
+        <w:t>Aserrado</w:t>
       </w:r>
     </w:p>
     <w:p>
@@ -1158,7 +1158,7 @@
       <w:r>
         <w:t>a)</w:t>
         <w:tab/>
-        <w:t>Limar o desbastar</w:t>
+        <w:t>Amolar</w:t>
       </w:r>
     </w:p>
     <w:p>
@@ -1188,7 +1188,7 @@
       <w:r>
         <w:t>d)</w:t>
         <w:tab/>
-        <w:t>Amolar</w:t>
+        <w:t>Limar o desbastar</w:t>
       </w:r>
     </w:p>
     <w:p>
@@ -1206,7 +1206,7 @@
       <w:r>
         <w:t>a)</w:t>
         <w:tab/>
-        <w:t>Lijar o pulir</w:t>
+        <w:t>Amolar</w:t>
       </w:r>
     </w:p>
     <w:p>
@@ -1226,7 +1226,7 @@
       <w:r>
         <w:t>c)</w:t>
         <w:tab/>
-        <w:t>Desbastar</w:t>
+        <w:t>Lijar o pulir</w:t>
       </w:r>
     </w:p>
     <w:p>
@@ -1236,7 +1236,7 @@
       <w:r>
         <w:t>d)</w:t>
         <w:tab/>
-        <w:t>Amolar</w:t>
+        <w:t>Desbastar</w:t>
       </w:r>
     </w:p>
     <w:p>
@@ -1254,6 +1254,16 @@
       <w:r>
         <w:t>a)</w:t>
         <w:tab/>
+        <w:t>Primero de numeración baja y luego de numeración alta</w:t>
+      </w:r>
+    </w:p>
+    <w:p>
+      <w:pPr>
+        <w:pStyle w:val="Choice"/>
+      </w:pPr>
+      <w:r>
+        <w:t>b)</w:t>
+        <w:tab/>
         <w:t>Directamente de numeración alta</w:t>
       </w:r>
     </w:p>
@@ -1262,33 +1272,23 @@
         <w:pStyle w:val="Choice"/>
       </w:pPr>
       <w:r>
-        <w:t>b)</w:t>
+        <w:t>c)</w:t>
+        <w:tab/>
+        <w:t>Primero de numeración alta y luego de numeración baja</w:t>
+      </w:r>
+    </w:p>
+    <w:p>
+      <w:pPr>
+        <w:pStyle w:val="Choice"/>
+      </w:pPr>
+      <w:r>
+        <w:t>d)</w:t>
         <w:tab/>
         <w:t>De numeración baja</w:t>
       </w:r>
     </w:p>
     <w:p>
       <w:pPr>
-        <w:pStyle w:val="Choice"/>
-      </w:pPr>
-      <w:r>
-        <w:t>c)</w:t>
-        <w:tab/>
-        <w:t>Primero de numeración baja y luego de numeración alta</w:t>
-      </w:r>
-    </w:p>
-    <w:p>
-      <w:pPr>
-        <w:pStyle w:val="Choice"/>
-      </w:pPr>
-      <w:r>
-        <w:t>d)</w:t>
-        <w:tab/>
-        <w:t>Primero de numeración alta y luego de numeración baja</w:t>
-      </w:r>
-    </w:p>
-    <w:p>
-      <w:pPr>
         <w:pStyle w:val="ListNumber"/>
       </w:pPr>
       <w:r>
@@ -1302,6 +1302,16 @@
       <w:r>
         <w:t>a)</w:t>
         <w:tab/>
+        <w:t>Clavar la madera</w:t>
+      </w:r>
+    </w:p>
+    <w:p>
+      <w:pPr>
+        <w:pStyle w:val="Choice"/>
+      </w:pPr>
+      <w:r>
+        <w:t>b)</w:t>
+        <w:tab/>
         <w:t>Taladrar la madera</w:t>
       </w:r>
     </w:p>
@@ -1310,9 +1320,9 @@
         <w:pStyle w:val="Choice"/>
       </w:pPr>
       <w:r>
-        <w:t>b)</w:t>
+        <w:t>c)</w:t>
         <w:tab/>
-        <w:t>Clavar la madera</w:t>
+        <w:t>Agujerear la madera</w:t>
       </w:r>
     </w:p>
     <w:p>
@@ -1320,23 +1330,13 @@
         <w:pStyle w:val="Choice"/>
       </w:pPr>
       <w:r>
-        <w:t>c)</w:t>
+        <w:t>d)</w:t>
         <w:tab/>
         <w:t>Troquelar la madera</w:t>
       </w:r>
     </w:p>
     <w:p>
       <w:pPr>
-        <w:pStyle w:val="Choice"/>
-      </w:pPr>
-      <w:r>
-        <w:t>d)</w:t>
-        <w:tab/>
-        <w:t>Agujerear la madera</w:t>
-      </w:r>
-    </w:p>
-    <w:p>
-      <w:pPr>
         <w:pStyle w:val="ListNumber"/>
       </w:pPr>
       <w:r>
@@ -1350,7 +1350,7 @@
       <w:r>
         <w:t>a)</w:t>
         <w:tab/>
-        <w:t>Ensambles</w:t>
+        <w:t>Clavos</w:t>
       </w:r>
     </w:p>
     <w:p>
@@ -1360,7 +1360,7 @@
       <w:r>
         <w:t>b)</w:t>
         <w:tab/>
-        <w:t>Clavos</w:t>
+        <w:t>Tornillos</w:t>
       </w:r>
     </w:p>
     <w:p>
@@ -1380,7 +1380,7 @@
       <w:r>
         <w:t>d)</w:t>
         <w:tab/>
-        <w:t>Tornillos</w:t>
+        <w:t>Ensambles</w:t>
       </w:r>
     </w:p>
     <w:p>
@@ -1505,7 +1505,7 @@
       <w:r>
         <w:t>c)</w:t>
         <w:tab/>
-        <w:t>Formón</w:t>
+        <w:t>Gubia</w:t>
       </w:r>
     </w:p>
     <w:p>
@@ -1515,7 +1515,7 @@
       <w:r>
         <w:t>d)</w:t>
         <w:tab/>
-        <w:t>Gubia</w:t>
+        <w:t>Formón</w:t>
       </w:r>
     </w:p>
     <w:p>
@@ -1572,6 +1572,16 @@
       <w:r>
         <w:t>a)</w:t>
         <w:tab/>
+        <w:t>Martillador</w:t>
+      </w:r>
+    </w:p>
+    <w:p>
+      <w:pPr>
+        <w:pStyle w:val="Choice"/>
+      </w:pPr>
+      <w:r>
+        <w:t>b)</w:t>
+        <w:tab/>
         <w:t>Clavador</w:t>
       </w:r>
     </w:p>
@@ -1580,7 +1590,7 @@
         <w:pStyle w:val="Choice"/>
       </w:pPr>
       <w:r>
-        <w:t>b)</w:t>
+        <w:t>c)</w:t>
         <w:tab/>
         <w:t>Martillo</w:t>
       </w:r>
@@ -1590,19 +1600,9 @@
         <w:pStyle w:val="Choice"/>
       </w:pPr>
       <w:r>
-        <w:t>c)</w:t>
+        <w:t>d)</w:t>
         <w:tab/>
         <w:t>Amartillador</w:t>
-      </w:r>
-    </w:p>
-    <w:p>
-      <w:pPr>
-        <w:pStyle w:val="Choice"/>
-      </w:pPr>
-      <w:r>
-        <w:t>d)</w:t>
-        <w:tab/>
-        <w:t>Martillador</w:t>
       </w:r>
     </w:p>
     <w:sectPr>

</xml_diff>